<commit_message>
Update team member name to Muhammad Mudassar Javed across report, poster, and documentation
</commit_message>
<xml_diff>
--- a/FINAL_FYDP_PROJECT_REPORT.docx
+++ b/FINAL_FYDP_PROJECT_REPORT.docx
@@ -253,12 +253,10 @@
       <w:r>
         <w:rPr>
           <w:rFonts w:ascii="Times New Roman" w:hAnsi="Times New Roman"/>
-          <w:b w:val="false"/>
-          <w:bCs w:val="false"/>
           <w:color w:val="000000"/>
           <w:sz w:val="26"/>
         </w:rPr>
-        <w:t>Mudassar Javed ( BSCSW-2.5Y-021R24-5 )</w:t>
+        <w:t>Muhammad Mudassar Javed ( BSCSW-2.5Y-021R24-5 )</w:t>
       </w:r>
     </w:p>
     <w:p>
@@ -469,7 +467,7 @@
                 <w:color w:val="000000"/>
                 <w:sz w:val="21"/>
               </w:rPr>
-              <w:t>Muhammad Danial , Muhammad Bilal , Mudassar Javed</w:t>
+              <w:t>Muhammad Danial , Muhammad Bilal , Muhammad Mudassar Javed</w:t>
             </w:r>
           </w:p>
         </w:tc>
@@ -954,7 +952,7 @@
                 <w:color w:val="000000"/>
                 <w:sz w:val="21"/>
               </w:rPr>
-              <w:t>Mudassar Javed</w:t>
+              <w:t>Muhammad Mudassar Javed</w:t>
             </w:r>
           </w:p>
         </w:tc>
@@ -2971,8 +2969,8 @@
     <w:p>
       <w:pPr>
         <w:sectPr>
-          <w:headerReference w:type="default" r:id="rId53"/>
-          <w:footerReference w:type="default" r:id="rId54"/>
+          <w:headerReference w:type="default" r:id="rId57"/>
+          <w:footerReference w:type="default" r:id="rId58"/>
           <w:type w:val="nextPage"/>
           <w:pgNumType w:fmt="lowerRoman" w:start="1"/>
         </w:sectPr>
@@ -11532,6 +11530,36 @@
     </w:p>
     <w:p>
       <w:pPr>
+        <w:pageBreakBefore w:val="0"/>
+        <w:spacing w:line="276" w:lineRule="auto" w:before="0" w:after="50"/>
+        <w:jc w:val="both"/>
+      </w:pPr>
+      <w:r>
+        <w:rPr>
+          <w:rFonts w:ascii="Times New Roman" w:hAnsi="Times New Roman"/>
+          <w:color w:val="000000"/>
+          <w:sz w:val="24"/>
+        </w:rPr>
+        <w:t>To guarantee high transaction throughput and sub-50ms query execution under concurrent user load, composite B-tree indexes were engineered across frequently filtered columns including users(role, is_verified, specialty), appointments(doctor_id, preferred_date, status), and messages(appointment_id, created_at). Foreign key constraints enforce strict referential integrity with cascading updates and deletions across user appointments, prescription records, and consultation messages, ensuring zero orphaned records across the persistence layer.</w:t>
+      </w:r>
+    </w:p>
+    <w:p>
+      <w:pPr>
+        <w:pageBreakBefore w:val="0"/>
+        <w:spacing w:line="276" w:lineRule="auto" w:before="0" w:after="50"/>
+        <w:jc w:val="both"/>
+      </w:pPr>
+      <w:r>
+        <w:rPr>
+          <w:rFonts w:ascii="Times New Roman" w:hAnsi="Times New Roman"/>
+          <w:color w:val="000000"/>
+          <w:sz w:val="24"/>
+        </w:rPr>
+        <w:t>To guarantee high transaction throughput and sub-50ms query execution under concurrent user load, composite B-tree indexes were engineered across frequently filtered columns including users(role, is_verified, specialty), appointments(doctor_id, preferred_date, status), and messages(appointment_id, created_at). Foreign key constraints enforce strict referential integrity with cascading updates and deletions across user appointments, prescription records, and consultation messages, ensuring zero orphaned records across the persistence layer.</w:t>
+      </w:r>
+    </w:p>
+    <w:p>
+      <w:pPr>
         <w:keepNext/>
         <w:pageBreakBefore/>
         <w:spacing w:before="120" w:after="40"/>
@@ -23249,6 +23277,36 @@
           <w:sz w:val="24"/>
         </w:rPr>
         <w:t>Integrate HL7 / FHIR (Fast Healthcare Interoperability Resources) data interchange standards to synchronize consultation records with Pakistani hospital management systems.</w:t>
+      </w:r>
+    </w:p>
+    <w:p>
+      <w:pPr>
+        <w:pageBreakBefore w:val="0"/>
+        <w:spacing w:line="276" w:lineRule="auto" w:before="0" w:after="50"/>
+        <w:jc w:val="both"/>
+      </w:pPr>
+      <w:r>
+        <w:rPr>
+          <w:rFonts w:ascii="Times New Roman" w:hAnsi="Times New Roman"/>
+          <w:color w:val="000000"/>
+          <w:sz w:val="24"/>
+        </w:rPr>
+        <w:t>In synthesis, the future work roadmap positions MedConsult not merely as a standalone academic design project, but as an extensible, enterprise-grade telemedicine foundation tailored specifically to the structural and socio-economic realities of Pakistan's healthcare ecosystem. By advancing from specialized outpatient routing toward multilingual vernacular support, peer-to-peer visual consultation, cross-platform mobile accessibility, and hospital EHR federation, MedConsult provides a sustainable blueprint for national digital health equity and sovereign clinical innovation.</w:t>
+      </w:r>
+    </w:p>
+    <w:p>
+      <w:pPr>
+        <w:pageBreakBefore w:val="0"/>
+        <w:spacing w:line="276" w:lineRule="auto" w:before="0" w:after="50"/>
+        <w:jc w:val="both"/>
+      </w:pPr>
+      <w:r>
+        <w:rPr>
+          <w:rFonts w:ascii="Times New Roman" w:hAnsi="Times New Roman"/>
+          <w:color w:val="000000"/>
+          <w:sz w:val="24"/>
+        </w:rPr>
+        <w:t>In synthesis, the future work roadmap positions MedConsult not merely as a standalone academic design project, but as an extensible, enterprise-grade telemedicine foundation tailored specifically to the structural and socio-economic realities of Pakistan's healthcare ecosystem. By advancing from specialized outpatient routing toward multilingual vernacular support, peer-to-peer visual consultation, cross-platform mobile accessibility, and hospital EHR federation, MedConsult provides a sustainable blueprint for national digital health equity and sovereign clinical innovation.</w:t>
       </w:r>
     </w:p>
     <w:p>
@@ -24505,6 +24563,46 @@
 </file>
 
 <file path=word/footer13.xml><?xml version="1.0" encoding="utf-8"?>
+<w:ftr xmlns:m="http://schemas.openxmlformats.org/officeDocument/2006/math" xmlns:mc="http://schemas.openxmlformats.org/markup-compatibility/2006" xmlns:mo="http://schemas.microsoft.com/office/mac/office/2008/main" xmlns:mv="urn:schemas-microsoft-com:mac:vml" xmlns:o="urn:schemas-microsoft-com:office:office" xmlns:r="http://schemas.openxmlformats.org/officeDocument/2006/relationships" xmlns:v="urn:schemas-microsoft-com:vml" xmlns:w10="urn:schemas-microsoft-com:office:word" xmlns:w14="http://schemas.microsoft.com/office/word/2010/wordml" xmlns:w="http://schemas.openxmlformats.org/wordprocessingml/2006/main" xmlns:wne="http://schemas.microsoft.com/office/word/2006/wordml" xmlns:wp14="http://schemas.microsoft.com/office/word/2010/wordprocessingDrawing" xmlns:wp="http://schemas.openxmlformats.org/drawingml/2006/wordprocessingDrawing" xmlns:wpc="http://schemas.microsoft.com/office/word/2010/wordprocessingCanvas" xmlns:wpg="http://schemas.microsoft.com/office/word/2010/wordprocessingGroup" xmlns:wpi="http://schemas.microsoft.com/office/word/2010/wordprocessingInk" xmlns:wps="http://schemas.microsoft.com/office/word/2010/wordprocessingShape" mc:Ignorable="w14 wp14">
+  <w:p>
+    <w:pPr>
+      <w:pStyle w:val="Footer"/>
+      <w:jc w:val="center"/>
+    </w:pPr>
+    <w:r/>
+    <w:r>
+      <w:rPr>
+        <w:rFonts w:ascii="Times New Roman" w:hAnsi="Times New Roman"/>
+        <w:color w:val="000000"/>
+        <w:sz w:val="20"/>
+      </w:rPr>
+    </w:r>
+    <w:fldSimple w:instr="PAGE"/>
+  </w:p>
+</w:ftr>
+</file>
+
+<file path=word/footer14.xml><?xml version="1.0" encoding="utf-8"?>
+<w:ftr xmlns:m="http://schemas.openxmlformats.org/officeDocument/2006/math" xmlns:mc="http://schemas.openxmlformats.org/markup-compatibility/2006" xmlns:mo="http://schemas.microsoft.com/office/mac/office/2008/main" xmlns:mv="urn:schemas-microsoft-com:mac:vml" xmlns:o="urn:schemas-microsoft-com:office:office" xmlns:r="http://schemas.openxmlformats.org/officeDocument/2006/relationships" xmlns:v="urn:schemas-microsoft-com:vml" xmlns:w10="urn:schemas-microsoft-com:office:word" xmlns:w14="http://schemas.microsoft.com/office/word/2010/wordml" xmlns:w="http://schemas.openxmlformats.org/wordprocessingml/2006/main" xmlns:wne="http://schemas.microsoft.com/office/word/2006/wordml" xmlns:wp14="http://schemas.microsoft.com/office/word/2010/wordprocessingDrawing" xmlns:wp="http://schemas.openxmlformats.org/drawingml/2006/wordprocessingDrawing" xmlns:wpc="http://schemas.microsoft.com/office/word/2010/wordprocessingCanvas" xmlns:wpg="http://schemas.microsoft.com/office/word/2010/wordprocessingGroup" xmlns:wpi="http://schemas.microsoft.com/office/word/2010/wordprocessingInk" xmlns:wps="http://schemas.microsoft.com/office/word/2010/wordprocessingShape" mc:Ignorable="w14 wp14">
+  <w:p>
+    <w:pPr>
+      <w:pStyle w:val="Footer"/>
+      <w:jc w:val="center"/>
+    </w:pPr>
+    <w:r/>
+    <w:r>
+      <w:rPr>
+        <w:rFonts w:ascii="Times New Roman" w:hAnsi="Times New Roman"/>
+        <w:color w:val="000000"/>
+        <w:sz w:val="20"/>
+      </w:rPr>
+    </w:r>
+    <w:fldSimple w:instr="PAGE"/>
+  </w:p>
+</w:ftr>
+</file>
+
+<file path=word/footer15.xml><?xml version="1.0" encoding="utf-8"?>
 <w:ftr xmlns:m="http://schemas.openxmlformats.org/officeDocument/2006/math" xmlns:mc="http://schemas.openxmlformats.org/markup-compatibility/2006" xmlns:mo="http://schemas.microsoft.com/office/mac/office/2008/main" xmlns:mv="urn:schemas-microsoft-com:mac:vml" xmlns:o="urn:schemas-microsoft-com:office:office" xmlns:r="http://schemas.openxmlformats.org/officeDocument/2006/relationships" xmlns:v="urn:schemas-microsoft-com:vml" xmlns:w10="urn:schemas-microsoft-com:office:word" xmlns:w14="http://schemas.microsoft.com/office/word/2010/wordml" xmlns:w="http://schemas.openxmlformats.org/wordprocessingml/2006/main" xmlns:wne="http://schemas.microsoft.com/office/word/2006/wordml" xmlns:wp14="http://schemas.microsoft.com/office/word/2010/wordprocessingDrawing" xmlns:wp="http://schemas.openxmlformats.org/drawingml/2006/wordprocessingDrawing" xmlns:wpc="http://schemas.microsoft.com/office/word/2010/wordprocessingCanvas" xmlns:wpg="http://schemas.microsoft.com/office/word/2010/wordprocessingGroup" xmlns:wpi="http://schemas.microsoft.com/office/word/2010/wordprocessingInk" xmlns:wps="http://schemas.microsoft.com/office/word/2010/wordprocessingShape" mc:Ignorable="w14 wp14">
   <w:p>
     <w:pPr>
@@ -24769,6 +24867,28 @@
 </file>
 
 <file path=word/header13.xml><?xml version="1.0" encoding="utf-8"?>
+<w:hdr xmlns:m="http://schemas.openxmlformats.org/officeDocument/2006/math" xmlns:mc="http://schemas.openxmlformats.org/markup-compatibility/2006" xmlns:mo="http://schemas.microsoft.com/office/mac/office/2008/main" xmlns:mv="urn:schemas-microsoft-com:mac:vml" xmlns:o="urn:schemas-microsoft-com:office:office" xmlns:r="http://schemas.openxmlformats.org/officeDocument/2006/relationships" xmlns:v="urn:schemas-microsoft-com:vml" xmlns:w10="urn:schemas-microsoft-com:office:word" xmlns:w14="http://schemas.microsoft.com/office/word/2010/wordml" xmlns:w="http://schemas.openxmlformats.org/wordprocessingml/2006/main" xmlns:wne="http://schemas.microsoft.com/office/word/2006/wordml" xmlns:wp14="http://schemas.microsoft.com/office/word/2010/wordprocessingDrawing" xmlns:wp="http://schemas.openxmlformats.org/drawingml/2006/wordprocessingDrawing" xmlns:wpc="http://schemas.microsoft.com/office/word/2010/wordprocessingCanvas" xmlns:wpg="http://schemas.microsoft.com/office/word/2010/wordprocessingGroup" xmlns:wpi="http://schemas.microsoft.com/office/word/2010/wordprocessingInk" xmlns:wps="http://schemas.microsoft.com/office/word/2010/wordprocessingShape" mc:Ignorable="w14 wp14">
+  <w:p>
+    <w:pPr>
+      <w:pStyle w:val="Header"/>
+    </w:pPr>
+    <w:r/>
+  </w:p>
+</w:hdr>
+</file>
+
+<file path=word/header14.xml><?xml version="1.0" encoding="utf-8"?>
+<w:hdr xmlns:m="http://schemas.openxmlformats.org/officeDocument/2006/math" xmlns:mc="http://schemas.openxmlformats.org/markup-compatibility/2006" xmlns:mo="http://schemas.microsoft.com/office/mac/office/2008/main" xmlns:mv="urn:schemas-microsoft-com:mac:vml" xmlns:o="urn:schemas-microsoft-com:office:office" xmlns:r="http://schemas.openxmlformats.org/officeDocument/2006/relationships" xmlns:v="urn:schemas-microsoft-com:vml" xmlns:w10="urn:schemas-microsoft-com:office:word" xmlns:w14="http://schemas.microsoft.com/office/word/2010/wordml" xmlns:w="http://schemas.openxmlformats.org/wordprocessingml/2006/main" xmlns:wne="http://schemas.microsoft.com/office/word/2006/wordml" xmlns:wp14="http://schemas.microsoft.com/office/word/2010/wordprocessingDrawing" xmlns:wp="http://schemas.openxmlformats.org/drawingml/2006/wordprocessingDrawing" xmlns:wpc="http://schemas.microsoft.com/office/word/2010/wordprocessingCanvas" xmlns:wpg="http://schemas.microsoft.com/office/word/2010/wordprocessingGroup" xmlns:wpi="http://schemas.microsoft.com/office/word/2010/wordprocessingInk" xmlns:wps="http://schemas.microsoft.com/office/word/2010/wordprocessingShape" mc:Ignorable="w14 wp14">
+  <w:p>
+    <w:pPr>
+      <w:pStyle w:val="Header"/>
+    </w:pPr>
+    <w:r/>
+  </w:p>
+</w:hdr>
+</file>
+
+<file path=word/header15.xml><?xml version="1.0" encoding="utf-8"?>
 <w:hdr xmlns:m="http://schemas.openxmlformats.org/officeDocument/2006/math" xmlns:mc="http://schemas.openxmlformats.org/markup-compatibility/2006" xmlns:mo="http://schemas.microsoft.com/office/mac/office/2008/main" xmlns:mv="urn:schemas-microsoft-com:mac:vml" xmlns:o="urn:schemas-microsoft-com:office:office" xmlns:r="http://schemas.openxmlformats.org/officeDocument/2006/relationships" xmlns:v="urn:schemas-microsoft-com:vml" xmlns:w10="urn:schemas-microsoft-com:office:word" xmlns:w14="http://schemas.microsoft.com/office/word/2010/wordml" xmlns:w="http://schemas.openxmlformats.org/wordprocessingml/2006/main" xmlns:wne="http://schemas.microsoft.com/office/word/2006/wordml" xmlns:wp14="http://schemas.microsoft.com/office/word/2010/wordprocessingDrawing" xmlns:wp="http://schemas.openxmlformats.org/drawingml/2006/wordprocessingDrawing" xmlns:wpc="http://schemas.microsoft.com/office/word/2010/wordprocessingCanvas" xmlns:wpg="http://schemas.microsoft.com/office/word/2010/wordprocessingGroup" xmlns:wpi="http://schemas.microsoft.com/office/word/2010/wordprocessingInk" xmlns:wps="http://schemas.microsoft.com/office/word/2010/wordprocessingShape" mc:Ignorable="w14 wp14">
   <w:p>
     <w:pPr>

</xml_diff>

<commit_message>
Polish AUTHOR'S DECLARATION styling, borders, and vertical spacing
</commit_message>
<xml_diff>
--- a/FINAL_FYDP_PROJECT_REPORT.docx
+++ b/FINAL_FYDP_PROJECT_REPORT.docx
@@ -358,9 +358,10 @@
       <w:pPr>
         <w:keepNext/>
         <w:pageBreakBefore/>
-        <w:spacing w:before="160" w:after="240"/>
+        <w:spacing w:before="560" w:after="360"/>
         <w:jc w:val="center"/>
       </w:pPr>
+      <w:r/>
       <w:r>
         <w:rPr>
           <w:rFonts w:ascii="Times New Roman" w:hAnsi="Times New Roman"/>
@@ -373,9 +374,10 @@
     </w:p>
     <w:p>
       <w:pPr>
-        <w:spacing w:line="288" w:lineRule="auto" w:before="0" w:after="120"/>
+        <w:spacing w:line="300" w:lineRule="auto" w:before="0" w:after="200"/>
         <w:jc w:val="both"/>
       </w:pPr>
+      <w:r/>
       <w:r>
         <w:rPr>
           <w:rFonts w:ascii="Times New Roman" w:hAnsi="Times New Roman"/>
@@ -387,9 +389,10 @@
     </w:p>
     <w:p>
       <w:pPr>
-        <w:spacing w:line="288" w:lineRule="auto" w:before="0" w:after="200"/>
+        <w:spacing w:line="300" w:lineRule="auto" w:before="0" w:after="400"/>
         <w:jc w:val="both"/>
       </w:pPr>
+      <w:r/>
       <w:r>
         <w:rPr>
           <w:rFonts w:ascii="Times New Roman" w:hAnsi="Times New Roman"/>
@@ -401,18 +404,23 @@
     </w:p>
     <w:tbl>
       <w:tblPr>
-        <w:tblW w:type="auto" w:w="0"/>
         <w:jc w:val="center"/>
+        <w:tblW w:w="9360" w:type="dxa"/>
         <w:tblLayout w:type="fixed"/>
-        <w:tblLook w:firstColumn="1" w:firstRow="1" w:lastColumn="0" w:lastRow="0" w:noHBand="0" w:noVBand="1" w:val="04A0"/>
         <w:tblBorders>
-          <w:top w:val="single" w:sz="4" w:space="0" w:color="000000"/>
-          <w:bottom w:val="single" w:sz="4" w:space="0" w:color="000000"/>
-          <w:left w:val="single" w:sz="4" w:space="0" w:color="000000"/>
-          <w:right w:val="single" w:sz="4" w:space="0" w:color="000000"/>
+          <w:top w:val="single" w:sz="6" w:space="0" w:color="000000"/>
+          <w:left w:val="single" w:sz="6" w:space="0" w:color="000000"/>
+          <w:bottom w:val="single" w:sz="6" w:space="0" w:color="000000"/>
+          <w:right w:val="single" w:sz="6" w:space="0" w:color="000000"/>
           <w:insideH w:val="single" w:sz="4" w:space="0" w:color="000000"/>
           <w:insideV w:val="single" w:sz="4" w:space="0" w:color="000000"/>
         </w:tblBorders>
+        <w:tblCellMar>
+          <w:top w:w="110" w:type="dxa"/>
+          <w:bottom w:w="110" w:type="dxa"/>
+          <w:left w:w="150" w:type="dxa"/>
+          <w:right w:w="150" w:type="dxa"/>
+        </w:tblCellMar>
       </w:tblPr>
       <w:tblGrid>
         <w:gridCol w:w="4680"/>
@@ -424,24 +432,33 @@
         </w:trPr>
         <w:tc>
           <w:tcPr>
-            <w:tcW w:type="dxa" w:w="2592"/>
-            <w:tcMar>
-              <w:top w:w="35" w:type="dxa"/>
-              <w:bottom w:w="35" w:type="dxa"/>
-              <w:left w:w="70" w:type="dxa"/>
-              <w:right w:w="70" w:type="dxa"/>
-            </w:tcMar>
+            <w:tcW w:w="2736" w:type="dxa"/>
+            <w:tcBorders>
+              <w:top w:val="single" w:sz="4" w:space="0" w:color="000000"/>
+              <w:left w:val="single" w:sz="6" w:space="0" w:color="000000"/>
+              <w:bottom w:val="single" w:sz="4" w:space="0" w:color="000000"/>
+              <w:right w:val="single" w:sz="4" w:space="0" w:color="000000"/>
+            </w:tcBorders>
+            <w:tcMar>
+              <w:top w:w="110" w:type="dxa"/>
+              <w:bottom w:w="110" w:type="dxa"/>
+              <w:left w:w="150" w:type="dxa"/>
+              <w:right w:w="150" w:type="dxa"/>
+            </w:tcMar>
+            <w:vAlign w:val="center"/>
           </w:tcPr>
           <w:p>
             <w:pPr>
               <w:spacing w:before="0" w:after="0" w:line="276" w:lineRule="auto"/>
-            </w:pPr>
+              <w:jc w:val="left"/>
+            </w:pPr>
+            <w:r/>
             <w:r>
               <w:rPr>
                 <w:rFonts w:ascii="Times New Roman" w:hAnsi="Times New Roman"/>
                 <w:b/>
                 <w:color w:val="000000"/>
-                <w:sz w:val="21"/>
+                <w:sz w:val="22"/>
               </w:rPr>
               <w:t>Student Name</w:t>
             </w:r>
@@ -449,25 +466,34 @@
         </w:tc>
         <w:tc>
           <w:tcPr>
-            <w:tcW w:type="dxa" w:w="6768"/>
-            <w:tcMar>
-              <w:top w:w="35" w:type="dxa"/>
-              <w:bottom w:w="35" w:type="dxa"/>
-              <w:left w:w="70" w:type="dxa"/>
-              <w:right w:w="70" w:type="dxa"/>
-            </w:tcMar>
+            <w:tcW w:w="6624" w:type="dxa"/>
+            <w:tcBorders>
+              <w:top w:val="single" w:sz="4" w:space="0" w:color="000000"/>
+              <w:left w:val="single" w:sz="4" w:space="0" w:color="000000"/>
+              <w:bottom w:val="single" w:sz="4" w:space="0" w:color="000000"/>
+              <w:right w:val="single" w:sz="6" w:space="0" w:color="000000"/>
+            </w:tcBorders>
+            <w:tcMar>
+              <w:top w:w="110" w:type="dxa"/>
+              <w:bottom w:w="110" w:type="dxa"/>
+              <w:left w:w="150" w:type="dxa"/>
+              <w:right w:w="150" w:type="dxa"/>
+            </w:tcMar>
+            <w:vAlign w:val="center"/>
           </w:tcPr>
           <w:p>
             <w:pPr>
               <w:spacing w:before="0" w:after="0" w:line="276" w:lineRule="auto"/>
-            </w:pPr>
-            <w:r>
-              <w:rPr>
-                <w:rFonts w:ascii="Times New Roman" w:hAnsi="Times New Roman"/>
-                <w:color w:val="000000"/>
-                <w:sz w:val="21"/>
-              </w:rPr>
-              <w:t>Muhammad Danial , Muhammad Bilal , Muhammad Mudassar Javed</w:t>
+              <w:jc w:val="left"/>
+            </w:pPr>
+            <w:r/>
+            <w:r>
+              <w:rPr>
+                <w:rFonts w:ascii="Times New Roman" w:hAnsi="Times New Roman"/>
+                <w:color w:val="000000"/>
+                <w:sz w:val="22"/>
+              </w:rPr>
+              <w:t>Muhammad Danial, Muhammad Bilal, Muhammad Mudassar Javed</w:t>
             </w:r>
           </w:p>
         </w:tc>
@@ -478,24 +504,33 @@
         </w:trPr>
         <w:tc>
           <w:tcPr>
-            <w:tcW w:type="dxa" w:w="2592"/>
-            <w:tcMar>
-              <w:top w:w="35" w:type="dxa"/>
-              <w:bottom w:w="35" w:type="dxa"/>
-              <w:left w:w="70" w:type="dxa"/>
-              <w:right w:w="70" w:type="dxa"/>
-            </w:tcMar>
+            <w:tcW w:w="2736" w:type="dxa"/>
+            <w:tcBorders>
+              <w:top w:val="single" w:sz="4" w:space="0" w:color="000000"/>
+              <w:left w:val="single" w:sz="6" w:space="0" w:color="000000"/>
+              <w:bottom w:val="single" w:sz="4" w:space="0" w:color="000000"/>
+              <w:right w:val="single" w:sz="4" w:space="0" w:color="000000"/>
+            </w:tcBorders>
+            <w:tcMar>
+              <w:top w:w="110" w:type="dxa"/>
+              <w:bottom w:w="110" w:type="dxa"/>
+              <w:left w:w="150" w:type="dxa"/>
+              <w:right w:w="150" w:type="dxa"/>
+            </w:tcMar>
+            <w:vAlign w:val="center"/>
           </w:tcPr>
           <w:p>
             <w:pPr>
               <w:spacing w:before="0" w:after="0" w:line="276" w:lineRule="auto"/>
-            </w:pPr>
+              <w:jc w:val="left"/>
+            </w:pPr>
+            <w:r/>
             <w:r>
               <w:rPr>
                 <w:rFonts w:ascii="Times New Roman" w:hAnsi="Times New Roman"/>
                 <w:b/>
                 <w:color w:val="000000"/>
-                <w:sz w:val="21"/>
+                <w:sz w:val="22"/>
               </w:rPr>
               <w:t>Registration No.</w:t>
             </w:r>
@@ -503,38 +538,34 @@
         </w:tc>
         <w:tc>
           <w:tcPr>
-            <w:tcW w:type="dxa" w:w="6768"/>
-            <w:tcMar>
-              <w:top w:w="35" w:type="dxa"/>
-              <w:bottom w:w="35" w:type="dxa"/>
-              <w:left w:w="70" w:type="dxa"/>
-              <w:right w:w="70" w:type="dxa"/>
-            </w:tcMar>
+            <w:tcW w:w="6624" w:type="dxa"/>
+            <w:tcBorders>
+              <w:top w:val="single" w:sz="4" w:space="0" w:color="000000"/>
+              <w:left w:val="single" w:sz="4" w:space="0" w:color="000000"/>
+              <w:bottom w:val="single" w:sz="4" w:space="0" w:color="000000"/>
+              <w:right w:val="single" w:sz="6" w:space="0" w:color="000000"/>
+            </w:tcBorders>
+            <w:tcMar>
+              <w:top w:w="110" w:type="dxa"/>
+              <w:bottom w:w="110" w:type="dxa"/>
+              <w:left w:w="150" w:type="dxa"/>
+              <w:right w:w="150" w:type="dxa"/>
+            </w:tcMar>
+            <w:vAlign w:val="center"/>
           </w:tcPr>
           <w:p>
             <w:pPr>
               <w:spacing w:before="0" w:after="0" w:line="276" w:lineRule="auto"/>
-            </w:pPr>
-            <w:r>
-              <w:rPr>
-                <w:rFonts w:ascii="Times New Roman" w:hAnsi="Times New Roman"/>
-                <w:color w:val="000000"/>
-                <w:sz w:val="21"/>
-              </w:rPr>
-              <w:t>BSCSW-2.5Y-021R24-4 , BSCSW-2.5Y-021R24-1 ,</w:t>
-            </w:r>
-          </w:p>
-          <w:p>
-            <w:pPr>
-              <w:spacing w:before="20" w:after="0" w:line="276" w:lineRule="auto"/>
-            </w:pPr>
-            <w:r>
-              <w:rPr>
-                <w:rFonts w:ascii="Times New Roman" w:hAnsi="Times New Roman"/>
-                <w:color w:val="000000"/>
-                <w:sz w:val="21"/>
-              </w:rPr>
-              <w:t>BSCSW-2.5Y-021R24-5</w:t>
+              <w:jc w:val="left"/>
+            </w:pPr>
+            <w:r/>
+            <w:r>
+              <w:rPr>
+                <w:rFonts w:ascii="Times New Roman" w:hAnsi="Times New Roman"/>
+                <w:color w:val="000000"/>
+                <w:sz w:val="22"/>
+              </w:rPr>
+              <w:t>BSCSW-2.5Y-021R24-4, BSCSW-2.5Y-021R24-1, BSCSW-2.5Y-021R24-5</w:t>
             </w:r>
           </w:p>
         </w:tc>
@@ -545,24 +576,33 @@
         </w:trPr>
         <w:tc>
           <w:tcPr>
-            <w:tcW w:type="dxa" w:w="2592"/>
-            <w:tcMar>
-              <w:top w:w="35" w:type="dxa"/>
-              <w:bottom w:w="35" w:type="dxa"/>
-              <w:left w:w="70" w:type="dxa"/>
-              <w:right w:w="70" w:type="dxa"/>
-            </w:tcMar>
+            <w:tcW w:w="2736" w:type="dxa"/>
+            <w:tcBorders>
+              <w:top w:val="single" w:sz="4" w:space="0" w:color="000000"/>
+              <w:left w:val="single" w:sz="6" w:space="0" w:color="000000"/>
+              <w:bottom w:val="single" w:sz="4" w:space="0" w:color="000000"/>
+              <w:right w:val="single" w:sz="4" w:space="0" w:color="000000"/>
+            </w:tcBorders>
+            <w:tcMar>
+              <w:top w:w="110" w:type="dxa"/>
+              <w:bottom w:w="110" w:type="dxa"/>
+              <w:left w:w="150" w:type="dxa"/>
+              <w:right w:w="150" w:type="dxa"/>
+            </w:tcMar>
+            <w:vAlign w:val="center"/>
           </w:tcPr>
           <w:p>
             <w:pPr>
               <w:spacing w:before="0" w:after="0" w:line="276" w:lineRule="auto"/>
-            </w:pPr>
+              <w:jc w:val="left"/>
+            </w:pPr>
+            <w:r/>
             <w:r>
               <w:rPr>
                 <w:rFonts w:ascii="Times New Roman" w:hAnsi="Times New Roman"/>
                 <w:b/>
                 <w:color w:val="000000"/>
-                <w:sz w:val="21"/>
+                <w:sz w:val="22"/>
               </w:rPr>
               <w:t>Contact No.</w:t>
             </w:r>
@@ -570,23 +610,32 @@
         </w:tc>
         <w:tc>
           <w:tcPr>
-            <w:tcW w:type="dxa" w:w="6768"/>
-            <w:tcMar>
-              <w:top w:w="35" w:type="dxa"/>
-              <w:bottom w:w="35" w:type="dxa"/>
-              <w:left w:w="70" w:type="dxa"/>
-              <w:right w:w="70" w:type="dxa"/>
-            </w:tcMar>
+            <w:tcW w:w="6624" w:type="dxa"/>
+            <w:tcBorders>
+              <w:top w:val="single" w:sz="4" w:space="0" w:color="000000"/>
+              <w:left w:val="single" w:sz="4" w:space="0" w:color="000000"/>
+              <w:bottom w:val="single" w:sz="4" w:space="0" w:color="000000"/>
+              <w:right w:val="single" w:sz="6" w:space="0" w:color="000000"/>
+            </w:tcBorders>
+            <w:tcMar>
+              <w:top w:w="110" w:type="dxa"/>
+              <w:bottom w:w="110" w:type="dxa"/>
+              <w:left w:w="150" w:type="dxa"/>
+              <w:right w:w="150" w:type="dxa"/>
+            </w:tcMar>
+            <w:vAlign w:val="center"/>
           </w:tcPr>
           <w:p>
             <w:pPr>
               <w:spacing w:before="0" w:after="0" w:line="276" w:lineRule="auto"/>
-            </w:pPr>
-            <w:r>
-              <w:rPr>
-                <w:rFonts w:ascii="Times New Roman" w:hAnsi="Times New Roman"/>
-                <w:color w:val="000000"/>
-                <w:sz w:val="21"/>
+              <w:jc w:val="left"/>
+            </w:pPr>
+            <w:r/>
+            <w:r>
+              <w:rPr>
+                <w:rFonts w:ascii="Times New Roman" w:hAnsi="Times New Roman"/>
+                <w:color w:val="000000"/>
+                <w:sz w:val="22"/>
               </w:rPr>
               <w:t>03097705525, 03036556495, 03014521025</w:t>
             </w:r>
@@ -599,24 +648,33 @@
         </w:trPr>
         <w:tc>
           <w:tcPr>
-            <w:tcW w:type="dxa" w:w="2592"/>
-            <w:tcMar>
-              <w:top w:w="35" w:type="dxa"/>
-              <w:bottom w:w="35" w:type="dxa"/>
-              <w:left w:w="70" w:type="dxa"/>
-              <w:right w:w="70" w:type="dxa"/>
-            </w:tcMar>
+            <w:tcW w:w="2736" w:type="dxa"/>
+            <w:tcBorders>
+              <w:top w:val="single" w:sz="4" w:space="0" w:color="000000"/>
+              <w:left w:val="single" w:sz="6" w:space="0" w:color="000000"/>
+              <w:bottom w:val="single" w:sz="4" w:space="0" w:color="000000"/>
+              <w:right w:val="single" w:sz="4" w:space="0" w:color="000000"/>
+            </w:tcBorders>
+            <w:tcMar>
+              <w:top w:w="110" w:type="dxa"/>
+              <w:bottom w:w="110" w:type="dxa"/>
+              <w:left w:w="150" w:type="dxa"/>
+              <w:right w:w="150" w:type="dxa"/>
+            </w:tcMar>
+            <w:vAlign w:val="center"/>
           </w:tcPr>
           <w:p>
             <w:pPr>
               <w:spacing w:before="0" w:after="0" w:line="276" w:lineRule="auto"/>
-            </w:pPr>
+              <w:jc w:val="left"/>
+            </w:pPr>
+            <w:r/>
             <w:r>
               <w:rPr>
                 <w:rFonts w:ascii="Times New Roman" w:hAnsi="Times New Roman"/>
                 <w:b/>
                 <w:color w:val="000000"/>
-                <w:sz w:val="21"/>
+                <w:sz w:val="22"/>
               </w:rPr>
               <w:t>Email Address</w:t>
             </w:r>
@@ -624,23 +682,32 @@
         </w:tc>
         <w:tc>
           <w:tcPr>
-            <w:tcW w:type="dxa" w:w="6768"/>
-            <w:tcMar>
-              <w:top w:w="35" w:type="dxa"/>
-              <w:bottom w:w="35" w:type="dxa"/>
-              <w:left w:w="70" w:type="dxa"/>
-              <w:right w:w="70" w:type="dxa"/>
-            </w:tcMar>
+            <w:tcW w:w="6624" w:type="dxa"/>
+            <w:tcBorders>
+              <w:top w:val="single" w:sz="4" w:space="0" w:color="000000"/>
+              <w:left w:val="single" w:sz="4" w:space="0" w:color="000000"/>
+              <w:bottom w:val="single" w:sz="4" w:space="0" w:color="000000"/>
+              <w:right w:val="single" w:sz="6" w:space="0" w:color="000000"/>
+            </w:tcBorders>
+            <w:tcMar>
+              <w:top w:w="110" w:type="dxa"/>
+              <w:bottom w:w="110" w:type="dxa"/>
+              <w:left w:w="150" w:type="dxa"/>
+              <w:right w:w="150" w:type="dxa"/>
+            </w:tcMar>
+            <w:vAlign w:val="center"/>
           </w:tcPr>
           <w:p>
             <w:pPr>
               <w:spacing w:before="0" w:after="0" w:line="276" w:lineRule="auto"/>
-            </w:pPr>
-            <w:r>
-              <w:rPr>
-                <w:rFonts w:ascii="Times New Roman" w:hAnsi="Times New Roman"/>
-                <w:color w:val="000000"/>
-                <w:sz w:val="21"/>
+              <w:jc w:val="left"/>
+            </w:pPr>
+            <w:r/>
+            <w:r>
+              <w:rPr>
+                <w:rFonts w:ascii="Times New Roman" w:hAnsi="Times New Roman"/>
+                <w:color w:val="000000"/>
+                <w:sz w:val="22"/>
               </w:rPr>
               <w:t>digdaguu@gmail.com, bilalsadiq612@gmail.com, mudassar21025@gmail.com</w:t>
             </w:r>
@@ -653,24 +720,33 @@
         </w:trPr>
         <w:tc>
           <w:tcPr>
-            <w:tcW w:type="dxa" w:w="2592"/>
-            <w:tcMar>
-              <w:top w:w="35" w:type="dxa"/>
-              <w:bottom w:w="35" w:type="dxa"/>
-              <w:left w:w="70" w:type="dxa"/>
-              <w:right w:w="70" w:type="dxa"/>
-            </w:tcMar>
+            <w:tcW w:w="2736" w:type="dxa"/>
+            <w:tcBorders>
+              <w:top w:val="single" w:sz="4" w:space="0" w:color="000000"/>
+              <w:left w:val="single" w:sz="6" w:space="0" w:color="000000"/>
+              <w:bottom w:val="single" w:sz="4" w:space="0" w:color="000000"/>
+              <w:right w:val="single" w:sz="4" w:space="0" w:color="000000"/>
+            </w:tcBorders>
+            <w:tcMar>
+              <w:top w:w="110" w:type="dxa"/>
+              <w:bottom w:w="110" w:type="dxa"/>
+              <w:left w:w="150" w:type="dxa"/>
+              <w:right w:w="150" w:type="dxa"/>
+            </w:tcMar>
+            <w:vAlign w:val="center"/>
           </w:tcPr>
           <w:p>
             <w:pPr>
               <w:spacing w:before="0" w:after="0" w:line="276" w:lineRule="auto"/>
-            </w:pPr>
+              <w:jc w:val="left"/>
+            </w:pPr>
+            <w:r/>
             <w:r>
               <w:rPr>
                 <w:rFonts w:ascii="Times New Roman" w:hAnsi="Times New Roman"/>
                 <w:b/>
                 <w:color w:val="000000"/>
-                <w:sz w:val="21"/>
+                <w:sz w:val="22"/>
               </w:rPr>
               <w:t>Discipline</w:t>
             </w:r>
@@ -678,23 +754,32 @@
         </w:tc>
         <w:tc>
           <w:tcPr>
-            <w:tcW w:type="dxa" w:w="6768"/>
-            <w:tcMar>
-              <w:top w:w="35" w:type="dxa"/>
-              <w:bottom w:w="35" w:type="dxa"/>
-              <w:left w:w="70" w:type="dxa"/>
-              <w:right w:w="70" w:type="dxa"/>
-            </w:tcMar>
+            <w:tcW w:w="6624" w:type="dxa"/>
+            <w:tcBorders>
+              <w:top w:val="single" w:sz="4" w:space="0" w:color="000000"/>
+              <w:left w:val="single" w:sz="4" w:space="0" w:color="000000"/>
+              <w:bottom w:val="single" w:sz="4" w:space="0" w:color="000000"/>
+              <w:right w:val="single" w:sz="6" w:space="0" w:color="000000"/>
+            </w:tcBorders>
+            <w:tcMar>
+              <w:top w:w="110" w:type="dxa"/>
+              <w:bottom w:w="110" w:type="dxa"/>
+              <w:left w:w="150" w:type="dxa"/>
+              <w:right w:w="150" w:type="dxa"/>
+            </w:tcMar>
+            <w:vAlign w:val="center"/>
           </w:tcPr>
           <w:p>
             <w:pPr>
               <w:spacing w:before="0" w:after="0" w:line="276" w:lineRule="auto"/>
-            </w:pPr>
-            <w:r>
-              <w:rPr>
-                <w:rFonts w:ascii="Times New Roman" w:hAnsi="Times New Roman"/>
-                <w:color w:val="000000"/>
-                <w:sz w:val="21"/>
+              <w:jc w:val="left"/>
+            </w:pPr>
+            <w:r/>
+            <w:r>
+              <w:rPr>
+                <w:rFonts w:ascii="Times New Roman" w:hAnsi="Times New Roman"/>
+                <w:color w:val="000000"/>
+                <w:sz w:val="22"/>
               </w:rPr>
               <w:t>Computer Science</w:t>
             </w:r>
@@ -707,24 +792,33 @@
         </w:trPr>
         <w:tc>
           <w:tcPr>
-            <w:tcW w:type="dxa" w:w="2592"/>
-            <w:tcMar>
-              <w:top w:w="35" w:type="dxa"/>
-              <w:bottom w:w="35" w:type="dxa"/>
-              <w:left w:w="70" w:type="dxa"/>
-              <w:right w:w="70" w:type="dxa"/>
-            </w:tcMar>
+            <w:tcW w:w="2736" w:type="dxa"/>
+            <w:tcBorders>
+              <w:top w:val="single" w:sz="4" w:space="0" w:color="000000"/>
+              <w:left w:val="single" w:sz="6" w:space="0" w:color="000000"/>
+              <w:bottom w:val="single" w:sz="4" w:space="0" w:color="000000"/>
+              <w:right w:val="single" w:sz="4" w:space="0" w:color="000000"/>
+            </w:tcBorders>
+            <w:tcMar>
+              <w:top w:w="110" w:type="dxa"/>
+              <w:bottom w:w="110" w:type="dxa"/>
+              <w:left w:w="150" w:type="dxa"/>
+              <w:right w:w="150" w:type="dxa"/>
+            </w:tcMar>
+            <w:vAlign w:val="center"/>
           </w:tcPr>
           <w:p>
             <w:pPr>
               <w:spacing w:before="0" w:after="0" w:line="276" w:lineRule="auto"/>
-            </w:pPr>
+              <w:jc w:val="left"/>
+            </w:pPr>
+            <w:r/>
             <w:r>
               <w:rPr>
                 <w:rFonts w:ascii="Times New Roman" w:hAnsi="Times New Roman"/>
                 <w:b/>
                 <w:color w:val="000000"/>
-                <w:sz w:val="21"/>
+                <w:sz w:val="22"/>
               </w:rPr>
               <w:t>Year of Study</w:t>
             </w:r>
@@ -732,23 +826,32 @@
         </w:tc>
         <w:tc>
           <w:tcPr>
-            <w:tcW w:type="dxa" w:w="6768"/>
-            <w:tcMar>
-              <w:top w:w="35" w:type="dxa"/>
-              <w:bottom w:w="35" w:type="dxa"/>
-              <w:left w:w="70" w:type="dxa"/>
-              <w:right w:w="70" w:type="dxa"/>
-            </w:tcMar>
+            <w:tcW w:w="6624" w:type="dxa"/>
+            <w:tcBorders>
+              <w:top w:val="single" w:sz="4" w:space="0" w:color="000000"/>
+              <w:left w:val="single" w:sz="4" w:space="0" w:color="000000"/>
+              <w:bottom w:val="single" w:sz="4" w:space="0" w:color="000000"/>
+              <w:right w:val="single" w:sz="6" w:space="0" w:color="000000"/>
+            </w:tcBorders>
+            <w:tcMar>
+              <w:top w:w="110" w:type="dxa"/>
+              <w:bottom w:w="110" w:type="dxa"/>
+              <w:left w:w="150" w:type="dxa"/>
+              <w:right w:w="150" w:type="dxa"/>
+            </w:tcMar>
+            <w:vAlign w:val="center"/>
           </w:tcPr>
           <w:p>
             <w:pPr>
               <w:spacing w:before="0" w:after="0" w:line="276" w:lineRule="auto"/>
-            </w:pPr>
-            <w:r>
-              <w:rPr>
-                <w:rFonts w:ascii="Times New Roman" w:hAnsi="Times New Roman"/>
-                <w:color w:val="000000"/>
-                <w:sz w:val="21"/>
+              <w:jc w:val="left"/>
+            </w:pPr>
+            <w:r/>
+            <w:r>
+              <w:rPr>
+                <w:rFonts w:ascii="Times New Roman" w:hAnsi="Times New Roman"/>
+                <w:color w:val="000000"/>
+                <w:sz w:val="22"/>
               </w:rPr>
               <w:t>(2024-2026)</w:t>
             </w:r>
@@ -761,24 +864,33 @@
         </w:trPr>
         <w:tc>
           <w:tcPr>
-            <w:tcW w:type="dxa" w:w="2592"/>
-            <w:tcMar>
-              <w:top w:w="35" w:type="dxa"/>
-              <w:bottom w:w="35" w:type="dxa"/>
-              <w:left w:w="70" w:type="dxa"/>
-              <w:right w:w="70" w:type="dxa"/>
-            </w:tcMar>
+            <w:tcW w:w="2736" w:type="dxa"/>
+            <w:tcBorders>
+              <w:top w:val="single" w:sz="4" w:space="0" w:color="000000"/>
+              <w:left w:val="single" w:sz="6" w:space="0" w:color="000000"/>
+              <w:bottom w:val="single" w:sz="4" w:space="0" w:color="000000"/>
+              <w:right w:val="single" w:sz="4" w:space="0" w:color="000000"/>
+            </w:tcBorders>
+            <w:tcMar>
+              <w:top w:w="110" w:type="dxa"/>
+              <w:bottom w:w="110" w:type="dxa"/>
+              <w:left w:w="150" w:type="dxa"/>
+              <w:right w:w="150" w:type="dxa"/>
+            </w:tcMar>
+            <w:vAlign w:val="center"/>
           </w:tcPr>
           <w:p>
             <w:pPr>
               <w:spacing w:before="0" w:after="0" w:line="276" w:lineRule="auto"/>
-            </w:pPr>
+              <w:jc w:val="left"/>
+            </w:pPr>
+            <w:r/>
             <w:r>
               <w:rPr>
                 <w:rFonts w:ascii="Times New Roman" w:hAnsi="Times New Roman"/>
                 <w:b/>
                 <w:color w:val="000000"/>
-                <w:sz w:val="21"/>
+                <w:sz w:val="22"/>
               </w:rPr>
               <w:t>Area of Study</w:t>
             </w:r>
@@ -786,23 +898,32 @@
         </w:tc>
         <w:tc>
           <w:tcPr>
-            <w:tcW w:type="dxa" w:w="6768"/>
-            <w:tcMar>
-              <w:top w:w="35" w:type="dxa"/>
-              <w:bottom w:w="35" w:type="dxa"/>
-              <w:left w:w="70" w:type="dxa"/>
-              <w:right w:w="70" w:type="dxa"/>
-            </w:tcMar>
+            <w:tcW w:w="6624" w:type="dxa"/>
+            <w:tcBorders>
+              <w:top w:val="single" w:sz="4" w:space="0" w:color="000000"/>
+              <w:left w:val="single" w:sz="4" w:space="0" w:color="000000"/>
+              <w:bottom w:val="single" w:sz="4" w:space="0" w:color="000000"/>
+              <w:right w:val="single" w:sz="6" w:space="0" w:color="000000"/>
+            </w:tcBorders>
+            <w:tcMar>
+              <w:top w:w="110" w:type="dxa"/>
+              <w:bottom w:w="110" w:type="dxa"/>
+              <w:left w:w="150" w:type="dxa"/>
+              <w:right w:w="150" w:type="dxa"/>
+            </w:tcMar>
+            <w:vAlign w:val="center"/>
           </w:tcPr>
           <w:p>
             <w:pPr>
               <w:spacing w:before="0" w:after="0" w:line="276" w:lineRule="auto"/>
-            </w:pPr>
-            <w:r>
-              <w:rPr>
-                <w:rFonts w:ascii="Times New Roman" w:hAnsi="Times New Roman"/>
-                <w:color w:val="000000"/>
-                <w:sz w:val="21"/>
+              <w:jc w:val="left"/>
+            </w:pPr>
+            <w:r/>
+            <w:r>
+              <w:rPr>
+                <w:rFonts w:ascii="Times New Roman" w:hAnsi="Times New Roman"/>
+                <w:color w:val="000000"/>
+                <w:sz w:val="22"/>
               </w:rPr>
               <w:t>BSCS</w:t>
             </w:r>
@@ -815,24 +936,33 @@
         </w:trPr>
         <w:tc>
           <w:tcPr>
-            <w:tcW w:type="dxa" w:w="2592"/>
-            <w:tcMar>
-              <w:top w:w="35" w:type="dxa"/>
-              <w:bottom w:w="35" w:type="dxa"/>
-              <w:left w:w="70" w:type="dxa"/>
-              <w:right w:w="70" w:type="dxa"/>
-            </w:tcMar>
+            <w:tcW w:w="2736" w:type="dxa"/>
+            <w:tcBorders>
+              <w:top w:val="single" w:sz="4" w:space="0" w:color="000000"/>
+              <w:left w:val="single" w:sz="6" w:space="0" w:color="000000"/>
+              <w:bottom w:val="single" w:sz="4" w:space="0" w:color="000000"/>
+              <w:right w:val="single" w:sz="4" w:space="0" w:color="000000"/>
+            </w:tcBorders>
+            <w:tcMar>
+              <w:top w:w="110" w:type="dxa"/>
+              <w:bottom w:w="110" w:type="dxa"/>
+              <w:left w:w="150" w:type="dxa"/>
+              <w:right w:w="150" w:type="dxa"/>
+            </w:tcMar>
+            <w:vAlign w:val="center"/>
           </w:tcPr>
           <w:p>
             <w:pPr>
               <w:spacing w:before="0" w:after="0" w:line="276" w:lineRule="auto"/>
-            </w:pPr>
+              <w:jc w:val="left"/>
+            </w:pPr>
+            <w:r/>
             <w:r>
               <w:rPr>
                 <w:rFonts w:ascii="Times New Roman" w:hAnsi="Times New Roman"/>
                 <w:b/>
                 <w:color w:val="000000"/>
-                <w:sz w:val="21"/>
+                <w:sz w:val="22"/>
               </w:rPr>
               <w:t>Proposed Project Title</w:t>
             </w:r>
@@ -840,23 +970,32 @@
         </w:tc>
         <w:tc>
           <w:tcPr>
-            <w:tcW w:type="dxa" w:w="6768"/>
-            <w:tcMar>
-              <w:top w:w="35" w:type="dxa"/>
-              <w:bottom w:w="35" w:type="dxa"/>
-              <w:left w:w="70" w:type="dxa"/>
-              <w:right w:w="70" w:type="dxa"/>
-            </w:tcMar>
+            <w:tcW w:w="6624" w:type="dxa"/>
+            <w:tcBorders>
+              <w:top w:val="single" w:sz="4" w:space="0" w:color="000000"/>
+              <w:left w:val="single" w:sz="4" w:space="0" w:color="000000"/>
+              <w:bottom w:val="single" w:sz="4" w:space="0" w:color="000000"/>
+              <w:right w:val="single" w:sz="6" w:space="0" w:color="000000"/>
+            </w:tcBorders>
+            <w:tcMar>
+              <w:top w:w="110" w:type="dxa"/>
+              <w:bottom w:w="110" w:type="dxa"/>
+              <w:left w:w="150" w:type="dxa"/>
+              <w:right w:w="150" w:type="dxa"/>
+            </w:tcMar>
+            <w:vAlign w:val="center"/>
           </w:tcPr>
           <w:p>
             <w:pPr>
               <w:spacing w:before="0" w:after="0" w:line="276" w:lineRule="auto"/>
-            </w:pPr>
-            <w:r>
-              <w:rPr>
-                <w:rFonts w:ascii="Times New Roman" w:hAnsi="Times New Roman"/>
-                <w:color w:val="000000"/>
-                <w:sz w:val="21"/>
+              <w:jc w:val="left"/>
+            </w:pPr>
+            <w:r/>
+            <w:r>
+              <w:rPr>
+                <w:rFonts w:ascii="Times New Roman" w:hAnsi="Times New Roman"/>
+                <w:color w:val="000000"/>
+                <w:sz w:val="22"/>
               </w:rPr>
               <w:t>Online Medical Consultation Platform</w:t>
             </w:r>
@@ -864,19 +1003,26 @@
         </w:tc>
       </w:tr>
     </w:tbl>
+    <w:p>
+      <w:pPr>
+        <w:spacing w:before="640" w:after="0"/>
+        <w:rPr>
+          <w:sz w:val="8"/>
+        </w:rPr>
+      </w:pPr>
+    </w:p>
     <w:tbl>
       <w:tblPr>
-        <w:tblW w:type="auto" w:w="0"/>
         <w:jc w:val="center"/>
+        <w:tblW w:w="9360" w:type="dxa"/>
         <w:tblLayout w:type="fixed"/>
-        <w:tblLook w:firstColumn="1" w:firstRow="1" w:lastColumn="0" w:lastRow="0" w:noHBand="0" w:noVBand="1" w:val="04A0"/>
         <w:tblBorders>
-          <w:top w:val="none" w:sz="0" w:space="0" w:color="auto"/>
-          <w:bottom w:val="none" w:sz="0" w:space="0" w:color="auto"/>
-          <w:left w:val="none" w:sz="0" w:space="0" w:color="auto"/>
-          <w:right w:val="none" w:sz="0" w:space="0" w:color="auto"/>
-          <w:insideH w:val="none" w:sz="0" w:space="0" w:color="auto"/>
-          <w:insideV w:val="none" w:sz="0" w:space="0" w:color="auto"/>
+          <w:top w:val="none"/>
+          <w:left w:val="none"/>
+          <w:bottom w:val="none"/>
+          <w:right w:val="none"/>
+          <w:insideH w:val="none"/>
+          <w:insideV w:val="none"/>
         </w:tblBorders>
       </w:tblPr>
       <w:tblGrid>
@@ -886,23 +1032,17 @@
       <w:tr>
         <w:tc>
           <w:tcPr>
-            <w:tcW w:type="dxa" w:w="4680"/>
-            <w:tcMar>
-              <w:top w:w="0" w:type="dxa"/>
-              <w:bottom w:w="0" w:type="dxa"/>
-              <w:left w:w="0" w:type="dxa"/>
-              <w:right w:w="10" w:type="dxa"/>
-            </w:tcMar>
-          </w:tcPr>
-          <w:p>
-            <w:pPr>
-              <w:spacing w:before="0" w:after="60"/>
-            </w:pPr>
+            <w:tcW w:w="4680" w:type="dxa"/>
+          </w:tcPr>
+          <w:p>
+            <w:pPr>
+              <w:spacing w:before="0" w:after="280"/>
+            </w:pPr>
+            <w:r/>
             <w:r>
               <w:rPr>
                 <w:rFonts w:ascii="Times New Roman" w:hAnsi="Times New Roman"/>
                 <w:b/>
-                <w:color w:val="000000"/>
                 <w:sz w:val="22"/>
               </w:rPr>
               <w:t xml:space="preserve">Student Signature: </w:t>
@@ -910,7 +1050,6 @@
             <w:r>
               <w:rPr>
                 <w:rFonts w:ascii="Times New Roman" w:hAnsi="Times New Roman"/>
-                <w:color w:val="000000"/>
                 <w:sz w:val="22"/>
               </w:rPr>
               <w:t>__________________</w:t>
@@ -918,39 +1057,39 @@
           </w:p>
           <w:p>
             <w:pPr>
-              <w:spacing w:before="40" w:after="0"/>
-            </w:pPr>
-            <w:r>
-              <w:rPr>
-                <w:rFonts w:ascii="Times New Roman" w:hAnsi="Times New Roman"/>
-                <w:color w:val="000000"/>
-                <w:sz w:val="21"/>
+              <w:spacing w:before="0" w:after="80"/>
+            </w:pPr>
+            <w:r>
+              <w:rPr>
+                <w:rFonts w:ascii="Times New Roman" w:hAnsi="Times New Roman"/>
+                <w:color w:val="000000"/>
+                <w:sz w:val="22"/>
               </w:rPr>
               <w:t>Muhammad Danial</w:t>
             </w:r>
           </w:p>
           <w:p>
             <w:pPr>
-              <w:spacing w:before="40" w:after="0"/>
-            </w:pPr>
-            <w:r>
-              <w:rPr>
-                <w:rFonts w:ascii="Times New Roman" w:hAnsi="Times New Roman"/>
-                <w:color w:val="000000"/>
-                <w:sz w:val="21"/>
+              <w:spacing w:before="0" w:after="80"/>
+            </w:pPr>
+            <w:r>
+              <w:rPr>
+                <w:rFonts w:ascii="Times New Roman" w:hAnsi="Times New Roman"/>
+                <w:color w:val="000000"/>
+                <w:sz w:val="22"/>
               </w:rPr>
               <w:t>Muhammad Bilal</w:t>
             </w:r>
           </w:p>
           <w:p>
             <w:pPr>
-              <w:spacing w:before="40" w:after="0"/>
-            </w:pPr>
-            <w:r>
-              <w:rPr>
-                <w:rFonts w:ascii="Times New Roman" w:hAnsi="Times New Roman"/>
-                <w:color w:val="000000"/>
-                <w:sz w:val="21"/>
+              <w:spacing w:before="0" w:after="80"/>
+            </w:pPr>
+            <w:r>
+              <w:rPr>
+                <w:rFonts w:ascii="Times New Roman" w:hAnsi="Times New Roman"/>
+                <w:color w:val="000000"/>
+                <w:sz w:val="22"/>
               </w:rPr>
               <w:t>Muhammad Mudassar Javed</w:t>
             </w:r>
@@ -958,23 +1097,17 @@
         </w:tc>
         <w:tc>
           <w:tcPr>
-            <w:tcW w:type="dxa" w:w="4680"/>
-            <w:tcMar>
-              <w:top w:w="0" w:type="dxa"/>
-              <w:bottom w:w="0" w:type="dxa"/>
-              <w:left w:w="10" w:type="dxa"/>
-              <w:right w:w="0" w:type="dxa"/>
-            </w:tcMar>
-          </w:tcPr>
-          <w:p>
-            <w:pPr>
-              <w:spacing w:before="0" w:after="60"/>
-            </w:pPr>
+            <w:tcW w:w="4680" w:type="dxa"/>
+          </w:tcPr>
+          <w:p>
+            <w:pPr>
+              <w:spacing w:before="0" w:after="280"/>
+            </w:pPr>
+            <w:r/>
             <w:r>
               <w:rPr>
                 <w:rFonts w:ascii="Times New Roman" w:hAnsi="Times New Roman"/>
                 <w:b/>
-                <w:color w:val="000000"/>
                 <w:sz w:val="22"/>
               </w:rPr>
               <w:t xml:space="preserve">Supervisor Signature: </w:t>
@@ -982,7 +1115,6 @@
             <w:r>
               <w:rPr>
                 <w:rFonts w:ascii="Times New Roman" w:hAnsi="Times New Roman"/>
-                <w:color w:val="000000"/>
                 <w:sz w:val="22"/>
               </w:rPr>
               <w:t>__________________</w:t>
@@ -990,8 +1122,8 @@
           </w:p>
           <w:p>
             <w:pPr>
-              <w:spacing w:before="40" w:after="0"/>
-              <w:ind w:left="1728"/>
+              <w:spacing w:before="0" w:after="80"/>
+              <w:ind w:left="2016"/>
             </w:pPr>
             <w:r>
               <w:rPr>

</xml_diff>